<commit_message>
feat: enterprise database layer (MySQL/SQLite), configurable Gemini API key, updated reports and latest screenshots
</commit_message>
<xml_diff>
--- a/Anaganti_Sairishikesh.docx
+++ b/Anaganti_Sairishikesh.docx
@@ -111,6 +111,24 @@
                 <w:color w:val="1E3A8A"/>
                 <w:sz w:val="22"/>
               </w:rPr>
+              <w:t xml:space="preserve">Guided by / Mentor: </w:t>
+            </w:r>
+            <w:r>
+              <w:rPr>
+                <w:rFonts w:ascii="Calibri" w:hAnsi="Calibri"/>
+                <w:color w:val="1F2937"/>
+                <w:sz w:val="22"/>
+              </w:rPr>
+              <w:t>Raghavendra Rao</w:t>
+              <w:br/>
+            </w:r>
+            <w:r>
+              <w:rPr>
+                <w:rFonts w:ascii="Calibri" w:hAnsi="Calibri"/>
+                <w:b/>
+                <w:color w:val="1E3A8A"/>
+                <w:sz w:val="22"/>
+              </w:rPr>
               <w:t xml:space="preserve">College / Institute Name: </w:t>
             </w:r>
             <w:r>
@@ -119,7 +137,7 @@
                 <w:color w:val="1F2937"/>
                 <w:sz w:val="22"/>
               </w:rPr>
-              <w:t>Engineering &amp; Technology Institute / University</w:t>
+              <w:t>Teegala Krishna Reddy Engineering College</w:t>
               <w:br/>
             </w:r>
             <w:r>
@@ -155,25 +173,7 @@
                 <w:color w:val="1F2937"/>
                 <w:sz w:val="22"/>
               </w:rPr>
-              <w:t>2025 - 2026</w:t>
-              <w:br/>
-            </w:r>
-            <w:r>
-              <w:rPr>
-                <w:rFonts w:ascii="Calibri" w:hAnsi="Calibri"/>
-                <w:b/>
-                <w:color w:val="1E3A8A"/>
-                <w:sz w:val="22"/>
-              </w:rPr>
-              <w:t xml:space="preserve">Guided by: </w:t>
-            </w:r>
-            <w:r>
-              <w:rPr>
-                <w:rFonts w:ascii="Calibri" w:hAnsi="Calibri"/>
-                <w:color w:val="1F2937"/>
-                <w:sz w:val="22"/>
-              </w:rPr>
-              <w:t>Faculty Project Mentor / Guide</w:t>
+              <w:t>Final Year (2026 - 2027)</w:t>
               <w:br/>
             </w:r>
             <w:r>
@@ -4141,8 +4141,137 @@
     </w:tbl>
     <w:p>
       <w:pPr>
-        <w:spacing w:after="0"/>
+        <w:spacing w:after="60"/>
       </w:pPr>
+    </w:p>
+    <w:p>
+      <w:pPr>
+        <w:pStyle w:val="Heading2"/>
+        <w:keepNext/>
+        <w:spacing w:before="120" w:after="40"/>
+      </w:pPr>
+      <w:r>
+        <w:rPr>
+          <w:rFonts w:ascii="Calibri" w:hAnsi="Calibri"/>
+          <w:b/>
+          <w:color w:val="2563EB"/>
+          <w:sz w:val="23"/>
+        </w:rPr>
+        <w:t>7.3 Enterprise Database &amp; CRM Persistence Layer (MySQL &amp; SQLite)</w:t>
+      </w:r>
+    </w:p>
+    <w:p>
+      <w:pPr>
+        <w:keepNext w:val="0"/>
+        <w:spacing w:before="0" w:after="60" w:line="269" w:lineRule="auto"/>
+      </w:pPr>
+      <w:r>
+        <w:rPr>
+          <w:rFonts w:ascii="Calibri" w:hAnsi="Calibri"/>
+          <w:color w:val="374151"/>
+          <w:sz w:val="20"/>
+        </w:rPr>
+        <w:t>TelcoPulse AI implements a robust dual database architecture that supports high-throughput relational persistence via MySQL (XAMPP port 3306) with seamless, zero-configuration local SQLite fallback. The database layer automatically initializes schema tables for customer diagnostic records, GenAI retention campaign logs, and batch inference runs.</w:t>
+      </w:r>
+    </w:p>
+    <w:p>
+      <w:pPr>
+        <w:pStyle w:val="ListBullet"/>
+        <w:spacing w:before="0" w:after="50" w:line="269" w:lineRule="auto"/>
+      </w:pPr>
+      <w:r>
+        <w:rPr>
+          <w:rFonts w:ascii="Calibri" w:hAnsi="Calibri"/>
+          <w:b/>
+          <w:color w:val="1F2937"/>
+          <w:sz w:val="20"/>
+        </w:rPr>
+        <w:t xml:space="preserve">1. Prediction Records Table (customer_predictions): </w:t>
+      </w:r>
+      <w:r>
+        <w:rPr>
+          <w:rFonts w:ascii="Calibri" w:hAnsi="Calibri"/>
+          <w:color w:val="374151"/>
+          <w:sz w:val="20"/>
+        </w:rPr>
+        <w:t>Stores complete customer telemetry, features, ML churn probabilities, risk tiers, and mathematical feature contributions.</w:t>
+      </w:r>
+    </w:p>
+    <w:p>
+      <w:pPr>
+        <w:pStyle w:val="ListBullet"/>
+        <w:spacing w:before="0" w:after="50" w:line="269" w:lineRule="auto"/>
+      </w:pPr>
+      <w:r>
+        <w:rPr>
+          <w:rFonts w:ascii="Calibri" w:hAnsi="Calibri"/>
+          <w:b/>
+          <w:color w:val="1F2937"/>
+          <w:sz w:val="20"/>
+        </w:rPr>
+        <w:t xml:space="preserve">2. Retention Campaigns Table (retention_campaigns): </w:t>
+      </w:r>
+      <w:r>
+        <w:rPr>
+          <w:rFonts w:ascii="Calibri" w:hAnsi="Calibri"/>
+          <w:color w:val="374151"/>
+          <w:sz w:val="20"/>
+        </w:rPr>
+        <w:t>Tracks generated emails, negotiation scripts, concession tiers, promo codes, and CRM campaign lifecycle statuses (Draft -&gt; Dispatched -&gt; Retained -&gt; Churned).</w:t>
+      </w:r>
+    </w:p>
+    <w:p>
+      <w:pPr>
+        <w:pStyle w:val="ListBullet"/>
+        <w:spacing w:before="0" w:after="50" w:line="269" w:lineRule="auto"/>
+      </w:pPr>
+      <w:r>
+        <w:rPr>
+          <w:rFonts w:ascii="Calibri" w:hAnsi="Calibri"/>
+          <w:b/>
+          <w:color w:val="1F2937"/>
+          <w:sz w:val="20"/>
+        </w:rPr>
+        <w:t xml:space="preserve">3. Analytical SQL Sandbox: </w:t>
+      </w:r>
+      <w:r>
+        <w:rPr>
+          <w:rFonts w:ascii="Calibri" w:hAnsi="Calibri"/>
+          <w:color w:val="374151"/>
+          <w:sz w:val="20"/>
+        </w:rPr>
+        <w:t>Enables business intelligence and data science teams to execute real-time ad-hoc SQL queries and export results directly within the application.</w:t>
+      </w:r>
+    </w:p>
+    <w:p>
+      <w:pPr>
+        <w:pStyle w:val="Heading2"/>
+        <w:keepNext/>
+        <w:spacing w:before="120" w:after="40"/>
+      </w:pPr>
+      <w:r>
+        <w:rPr>
+          <w:rFonts w:ascii="Calibri" w:hAnsi="Calibri"/>
+          <w:b/>
+          <w:color w:val="2563EB"/>
+          <w:sz w:val="23"/>
+        </w:rPr>
+        <w:t>7.4 Live Google Gemini Cloud LLM Integration</w:t>
+      </w:r>
+    </w:p>
+    <w:p>
+      <w:pPr>
+        <w:keepNext w:val="0"/>
+        <w:spacing w:before="0" w:after="60" w:line="269" w:lineRule="auto"/>
+      </w:pPr>
+      <w:r>
+        <w:rPr>
+          <w:rFonts w:ascii="Calibri" w:hAnsi="Calibri"/>
+          <w:color w:val="374151"/>
+          <w:sz w:val="20"/>
+        </w:rPr>
+        <w:t>The system seamlessly interfaces with Google's state-of-the-art Gemini LLM API (gemini-1.5-flash) for live cloud-native generative inference. The application is pre-configured with a default active Gemini API key while providing an editable UI text input, dynamically adapting the copywriting narrative based on real-time subscriber churn drivers, temperature parameters, and target outreach channels.</w:t>
+      </w:r>
     </w:p>
     <w:p>
       <w:r>
@@ -6078,6 +6207,391 @@
       <w:pPr>
         <w:pStyle w:val="Heading1"/>
         <w:keepNext/>
+        <w:spacing w:before="0" w:after="60"/>
+      </w:pPr>
+      <w:r>
+        <w:rPr>
+          <w:rFonts w:ascii="Calibri" w:hAnsi="Calibri"/>
+          <w:b/>
+          <w:color w:val="1E3A8A"/>
+          <w:sz w:val="28"/>
+        </w:rPr>
+        <w:t>8. User Interface: 8.6 Enterprise Database &amp; Customer CRM Explorer</w:t>
+      </w:r>
+    </w:p>
+    <w:p>
+      <w:pPr>
+        <w:keepNext w:val="0"/>
+        <w:spacing w:before="0" w:after="80" w:line="269" w:lineRule="auto"/>
+      </w:pPr>
+      <w:r>
+        <w:rPr>
+          <w:rFonts w:ascii="Calibri" w:hAnsi="Calibri"/>
+          <w:color w:val="374151"/>
+          <w:sz w:val="20"/>
+        </w:rPr>
+        <w:t>The Enterprise Database &amp; Customer CRM Explorer provides persistent data storage across MySQL (XAMPP Port 3306) and SQLite. It enables retention managers to query diagnostic histories, update outreach campaign lifecycle states, and execute direct SQL queries.</w:t>
+      </w:r>
+    </w:p>
+    <w:p>
+      <w:r>
+        <w:drawing>
+          <wp:inline xmlns:a="http://schemas.openxmlformats.org/drawingml/2006/main" xmlns:pic="http://schemas.openxmlformats.org/drawingml/2006/picture">
+            <wp:extent cx="5669280" cy="3526917"/>
+            <wp:docPr id="7" name="Picture 7"/>
+            <wp:cNvGraphicFramePr>
+              <a:graphicFrameLocks noChangeAspect="1"/>
+            </wp:cNvGraphicFramePr>
+            <a:graphic>
+              <a:graphicData uri="http://schemas.openxmlformats.org/drawingml/2006/picture">
+                <pic:pic>
+                  <pic:nvPicPr>
+                    <pic:cNvPr id="0" name="06_database_crm_explorer.png"/>
+                    <pic:cNvPicPr/>
+                  </pic:nvPicPr>
+                  <pic:blipFill>
+                    <a:blip r:embed="rId17"/>
+                    <a:stretch>
+                      <a:fillRect/>
+                    </a:stretch>
+                  </pic:blipFill>
+                  <pic:spPr>
+                    <a:xfrm>
+                      <a:off x="0" y="0"/>
+                      <a:ext cx="5669280" cy="3526917"/>
+                    </a:xfrm>
+                    <a:prstGeom prst="rect"/>
+                  </pic:spPr>
+                </pic:pic>
+              </a:graphicData>
+            </a:graphic>
+          </wp:inline>
+        </w:drawing>
+      </w:r>
+    </w:p>
+    <w:p>
+      <w:pPr>
+        <w:spacing w:before="40" w:after="80"/>
+        <w:jc w:val="center"/>
+      </w:pPr>
+      <w:r>
+        <w:rPr>
+          <w:rFonts w:ascii="Calibri" w:hAnsi="Calibri"/>
+          <w:i/>
+          <w:color w:val="6B7280"/>
+          <w:sz w:val="17"/>
+        </w:rPr>
+        <w:t>Figure 7: Enterprise Database &amp; Customer CRM Explorer with Live SQL Sandbox</w:t>
+      </w:r>
+    </w:p>
+    <w:tbl>
+      <w:tblPr>
+        <w:tblW w:type="auto" w:w="0"/>
+        <w:jc w:val="center"/>
+        <w:tblLook w:firstColumn="1" w:firstRow="1" w:lastColumn="0" w:lastRow="0" w:noHBand="0" w:noVBand="1" w:val="04A0"/>
+      </w:tblPr>
+      <w:tblGrid>
+        <w:gridCol w:w="5040"/>
+        <w:gridCol w:w="5040"/>
+      </w:tblGrid>
+      <w:tr>
+        <w:trPr>
+          <w:tblHeader/>
+          <w:cantSplit/>
+        </w:trPr>
+        <w:tc>
+          <w:tcPr>
+            <w:tcW w:type="dxa" w:w="3168"/>
+            <w:shd w:fill="1E3A8A"/>
+            <w:tcMar>
+              <w:top w:w="80" w:type="dxa"/>
+              <w:bottom w:w="80" w:type="dxa"/>
+              <w:left w:w="80" w:type="dxa"/>
+              <w:right w:w="80" w:type="dxa"/>
+            </w:tcMar>
+          </w:tcPr>
+          <w:p>
+            <w:pPr>
+              <w:spacing w:after="0"/>
+              <w:jc w:val="center"/>
+            </w:pPr>
+            <w:r>
+              <w:rPr>
+                <w:rFonts w:ascii="Calibri" w:hAnsi="Calibri"/>
+                <w:b/>
+                <w:color w:val="FFFFFF"/>
+                <w:sz w:val="18"/>
+              </w:rPr>
+              <w:t>Key Feature / UI Component</w:t>
+            </w:r>
+          </w:p>
+        </w:tc>
+        <w:tc>
+          <w:tcPr>
+            <w:tcW w:type="dxa" w:w="6912"/>
+            <w:shd w:fill="1E3A8A"/>
+            <w:tcMar>
+              <w:top w:w="80" w:type="dxa"/>
+              <w:bottom w:w="80" w:type="dxa"/>
+              <w:left w:w="80" w:type="dxa"/>
+              <w:right w:w="80" w:type="dxa"/>
+            </w:tcMar>
+          </w:tcPr>
+          <w:p>
+            <w:pPr>
+              <w:spacing w:after="0"/>
+              <w:jc w:val="center"/>
+            </w:pPr>
+            <w:r>
+              <w:rPr>
+                <w:rFonts w:ascii="Calibri" w:hAnsi="Calibri"/>
+                <w:b/>
+                <w:color w:val="FFFFFF"/>
+                <w:sz w:val="18"/>
+              </w:rPr>
+              <w:t>Operational Purpose &amp; Business Value</w:t>
+            </w:r>
+          </w:p>
+        </w:tc>
+      </w:tr>
+      <w:tr>
+        <w:trPr>
+          <w:cantSplit/>
+        </w:trPr>
+        <w:tc>
+          <w:tcPr>
+            <w:tcW w:type="dxa" w:w="3168"/>
+            <w:shd w:fill="FFFFFF"/>
+            <w:tcMar>
+              <w:top w:w="35" w:type="dxa"/>
+              <w:bottom w:w="35" w:type="dxa"/>
+              <w:left w:w="80" w:type="dxa"/>
+              <w:right w:w="80" w:type="dxa"/>
+            </w:tcMar>
+          </w:tcPr>
+          <w:p>
+            <w:pPr>
+              <w:spacing w:after="0"/>
+              <w:jc w:val="left"/>
+            </w:pPr>
+            <w:r>
+              <w:rPr>
+                <w:rFonts w:ascii="Calibri" w:hAnsi="Calibri"/>
+                <w:color w:val="1F2937"/>
+                <w:sz w:val="17"/>
+              </w:rPr>
+              <w:t>Database Dashboard &amp; KPI Metrics</w:t>
+            </w:r>
+          </w:p>
+        </w:tc>
+        <w:tc>
+          <w:tcPr>
+            <w:tcW w:type="dxa" w:w="6912"/>
+            <w:shd w:fill="FFFFFF"/>
+            <w:tcMar>
+              <w:top w:w="35" w:type="dxa"/>
+              <w:bottom w:w="35" w:type="dxa"/>
+              <w:left w:w="80" w:type="dxa"/>
+              <w:right w:w="80" w:type="dxa"/>
+            </w:tcMar>
+          </w:tcPr>
+          <w:p>
+            <w:pPr>
+              <w:spacing w:after="0"/>
+              <w:jc w:val="left"/>
+            </w:pPr>
+            <w:r>
+              <w:rPr>
+                <w:rFonts w:ascii="Calibri" w:hAnsi="Calibri"/>
+                <w:color w:val="1F2937"/>
+                <w:sz w:val="17"/>
+              </w:rPr>
+              <w:t>Tracks total persisted diagnoses, critical churn exposure count, and average churn probability.</w:t>
+            </w:r>
+          </w:p>
+        </w:tc>
+      </w:tr>
+      <w:tr>
+        <w:trPr>
+          <w:cantSplit/>
+        </w:trPr>
+        <w:tc>
+          <w:tcPr>
+            <w:tcW w:type="dxa" w:w="3168"/>
+            <w:shd w:fill="F8FAFC"/>
+            <w:tcMar>
+              <w:top w:w="35" w:type="dxa"/>
+              <w:bottom w:w="35" w:type="dxa"/>
+              <w:left w:w="80" w:type="dxa"/>
+              <w:right w:w="80" w:type="dxa"/>
+            </w:tcMar>
+          </w:tcPr>
+          <w:p>
+            <w:pPr>
+              <w:spacing w:after="0"/>
+              <w:jc w:val="left"/>
+            </w:pPr>
+            <w:r>
+              <w:rPr>
+                <w:rFonts w:ascii="Calibri" w:hAnsi="Calibri"/>
+                <w:color w:val="1F2937"/>
+                <w:sz w:val="17"/>
+              </w:rPr>
+              <w:t>Customer Predictions Table</w:t>
+            </w:r>
+          </w:p>
+        </w:tc>
+        <w:tc>
+          <w:tcPr>
+            <w:tcW w:type="dxa" w:w="6912"/>
+            <w:shd w:fill="F8FAFC"/>
+            <w:tcMar>
+              <w:top w:w="35" w:type="dxa"/>
+              <w:bottom w:w="35" w:type="dxa"/>
+              <w:left w:w="80" w:type="dxa"/>
+              <w:right w:w="80" w:type="dxa"/>
+            </w:tcMar>
+          </w:tcPr>
+          <w:p>
+            <w:pPr>
+              <w:spacing w:after="0"/>
+              <w:jc w:val="left"/>
+            </w:pPr>
+            <w:r>
+              <w:rPr>
+                <w:rFonts w:ascii="Calibri" w:hAnsi="Calibri"/>
+                <w:color w:val="1F2937"/>
+                <w:sz w:val="17"/>
+              </w:rPr>
+              <w:t>Searchable, filterable ledger of all assessed accounts with 1-click CSV export.</w:t>
+            </w:r>
+          </w:p>
+        </w:tc>
+      </w:tr>
+      <w:tr>
+        <w:trPr>
+          <w:cantSplit/>
+        </w:trPr>
+        <w:tc>
+          <w:tcPr>
+            <w:tcW w:type="dxa" w:w="3168"/>
+            <w:shd w:fill="FFFFFF"/>
+            <w:tcMar>
+              <w:top w:w="35" w:type="dxa"/>
+              <w:bottom w:w="35" w:type="dxa"/>
+              <w:left w:w="80" w:type="dxa"/>
+              <w:right w:w="80" w:type="dxa"/>
+            </w:tcMar>
+          </w:tcPr>
+          <w:p>
+            <w:pPr>
+              <w:spacing w:after="0"/>
+              <w:jc w:val="left"/>
+            </w:pPr>
+            <w:r>
+              <w:rPr>
+                <w:rFonts w:ascii="Calibri" w:hAnsi="Calibri"/>
+                <w:color w:val="1F2937"/>
+                <w:sz w:val="17"/>
+              </w:rPr>
+              <w:t>GenAI Campaign Log &amp; Tracker</w:t>
+            </w:r>
+          </w:p>
+        </w:tc>
+        <w:tc>
+          <w:tcPr>
+            <w:tcW w:type="dxa" w:w="6912"/>
+            <w:shd w:fill="FFFFFF"/>
+            <w:tcMar>
+              <w:top w:w="35" w:type="dxa"/>
+              <w:bottom w:w="35" w:type="dxa"/>
+              <w:left w:w="80" w:type="dxa"/>
+              <w:right w:w="80" w:type="dxa"/>
+            </w:tcMar>
+          </w:tcPr>
+          <w:p>
+            <w:pPr>
+              <w:spacing w:after="0"/>
+              <w:jc w:val="left"/>
+            </w:pPr>
+            <w:r>
+              <w:rPr>
+                <w:rFonts w:ascii="Calibri" w:hAnsi="Calibri"/>
+                <w:color w:val="1F2937"/>
+                <w:sz w:val="17"/>
+              </w:rPr>
+              <w:t>Maintains campaign states (Generated -&gt; Dispatched -&gt; Retained -&gt; Churned) and pitch previews.</w:t>
+            </w:r>
+          </w:p>
+        </w:tc>
+      </w:tr>
+      <w:tr>
+        <w:trPr>
+          <w:cantSplit/>
+        </w:trPr>
+        <w:tc>
+          <w:tcPr>
+            <w:tcW w:type="dxa" w:w="3168"/>
+            <w:shd w:fill="F8FAFC"/>
+            <w:tcMar>
+              <w:top w:w="35" w:type="dxa"/>
+              <w:bottom w:w="35" w:type="dxa"/>
+              <w:left w:w="80" w:type="dxa"/>
+              <w:right w:w="80" w:type="dxa"/>
+            </w:tcMar>
+          </w:tcPr>
+          <w:p>
+            <w:pPr>
+              <w:spacing w:after="0"/>
+              <w:jc w:val="left"/>
+            </w:pPr>
+            <w:r>
+              <w:rPr>
+                <w:rFonts w:ascii="Calibri" w:hAnsi="Calibri"/>
+                <w:color w:val="1F2937"/>
+                <w:sz w:val="17"/>
+              </w:rPr>
+              <w:t>Direct Analytical SQL Sandbox</w:t>
+            </w:r>
+          </w:p>
+        </w:tc>
+        <w:tc>
+          <w:tcPr>
+            <w:tcW w:type="dxa" w:w="6912"/>
+            <w:shd w:fill="F8FAFC"/>
+            <w:tcMar>
+              <w:top w:w="35" w:type="dxa"/>
+              <w:bottom w:w="35" w:type="dxa"/>
+              <w:left w:w="80" w:type="dxa"/>
+              <w:right w:w="80" w:type="dxa"/>
+            </w:tcMar>
+          </w:tcPr>
+          <w:p>
+            <w:pPr>
+              <w:spacing w:after="0"/>
+              <w:jc w:val="left"/>
+            </w:pPr>
+            <w:r>
+              <w:rPr>
+                <w:rFonts w:ascii="Calibri" w:hAnsi="Calibri"/>
+                <w:color w:val="1F2937"/>
+                <w:sz w:val="17"/>
+              </w:rPr>
+              <w:t>Executes real-time SQL queries with execution time logging and instant table visualization.</w:t>
+            </w:r>
+          </w:p>
+        </w:tc>
+      </w:tr>
+    </w:tbl>
+    <w:p>
+      <w:r>
+        <w:br w:type="page"/>
+      </w:r>
+    </w:p>
+    <w:p>
+      <w:pPr>
+        <w:pStyle w:val="Heading1"/>
+        <w:keepNext/>
         <w:spacing w:before="0" w:after="80"/>
       </w:pPr>
       <w:r>

</xml_diff>